<commit_message>
changing a Chinese Document
</commit_message>
<xml_diff>
--- a/Chinese_documents/自然资源监测作业过程.docx
+++ b/Chinese_documents/自然资源监测作业过程.docx
@@ -302,6 +302,42 @@
         <w:rPr>
           <w:rFonts w:hint="eastAsia"/>
         </w:rPr>
+        <w:t>“</w:t>
+      </w:r>
+      <w:r>
+        <w:rPr>
+          <w:rFonts w:hint="eastAsia"/>
+        </w:rPr>
+        <w:t>“</w:t>
+      </w:r>
+      <w:r>
+        <w:rPr>
+          <w:rFonts w:ascii="宋体" w:hAnsi="宋体" w:cs="宋体"/>
+        </w:rPr>
+        <w:t>整 个 西南地区最佳统计窗口为５２×５２（２．４３ｋｍ２）</w:t>
+      </w:r>
+      <w:r>
+        <w:rPr>
+          <w:rFonts w:ascii="宋体" w:hAnsi="宋体" w:cs="宋体" w:hint="eastAsia"/>
+        </w:rPr>
+        <w:t>……</w:t>
+      </w:r>
+      <w:r>
+        <w:rPr>
+          <w:rFonts w:ascii="宋体" w:hAnsi="宋体" w:cs="宋体"/>
+        </w:rPr>
+        <w:t>通过计算５２×５２（２．４３ｋｍ２）窗口下西南地区地 形起伏度值，得到整个西南地区地形起伏度的专题图 层。</w:t>
+      </w:r>
+      <w:r>
+        <w:rPr>
+          <w:rFonts w:hint="eastAsia"/>
+        </w:rPr>
+        <w:t>”</w:t>
+      </w:r>
+      <w:r>
+        <w:rPr>
+          <w:rFonts w:hint="eastAsia"/>
+        </w:rPr>
         <w:t>中</w:t>
       </w:r>
       <w:r>
@@ -320,6 +356,24 @@
         <w:rPr>
           <w:rFonts w:hint="eastAsia"/>
         </w:rPr>
+        <w:t>对</w:t>
+      </w:r>
+      <w:r>
+        <w:rPr>
+          <w:rFonts w:hint="eastAsia"/>
+        </w:rPr>
+        <w:t>DEM</w:t>
+      </w:r>
+      <w:r>
+        <w:rPr>
+          <w:rFonts w:hint="eastAsia"/>
+        </w:rPr>
+        <w:t>，</w:t>
+      </w:r>
+      <w:r>
+        <w:rPr>
+          <w:rFonts w:hint="eastAsia"/>
+        </w:rPr>
         <w:t>选择领域范围为</w:t>
       </w:r>
       <w:r>
@@ -332,6 +386,12 @@
         <w:rPr>
           <w:rFonts w:hint="eastAsia"/>
         </w:rPr>
+        <w:t>*17</w:t>
+      </w:r>
+      <w:r>
+        <w:rPr>
+          <w:rFonts w:hint="eastAsia"/>
+        </w:rPr>
         <w:t>个</w:t>
       </w:r>
       <w:r>
@@ -353,16 +413,16 @@
         <w:t>（</w:t>
       </w:r>
       <w:r>
-        <w:t>≈1.53</w:t>
-      </w:r>
-      <w:r>
-        <w:rPr>
-          <w:rFonts w:hint="eastAsia"/>
-        </w:rPr>
-        <w:t>*1.53</w:t>
-      </w:r>
-      <w:r>
-        <w:t xml:space="preserve"> km²</w:t>
+        <w:t>≈</w:t>
+      </w:r>
+      <w:r>
+        <w:rPr>
+          <w:rFonts w:hint="eastAsia"/>
+        </w:rPr>
+        <w:t>2.34</w:t>
+      </w:r>
+      <w:r>
+        <w:t>km²</w:t>
       </w:r>
       <w:r>
         <w:rPr>
@@ -374,19 +434,14 @@
         <w:rPr>
           <w:rFonts w:hint="eastAsia"/>
         </w:rPr>
-        <w:t>对</w:t>
-      </w:r>
-      <w:r>
-        <w:rPr>
-          <w:rFonts w:hint="eastAsia"/>
-        </w:rPr>
-        <w:t>DEM</w:t>
-      </w:r>
-      <w:r>
-        <w:rPr>
-          <w:rFonts w:hint="eastAsia"/>
-        </w:rPr>
-        <w:t>进行焦点统计，统计此格网范围内的最大值与最小值之差。再用以上标准将起伏度重分类，得到广西区的地形起伏数据。</w:t>
+        <w:t>进行焦点统计，统计此格网范围内的最</w:t>
+      </w:r>
+      <w:r>
+        <w:rPr>
+          <w:rFonts w:hint="eastAsia"/>
+        </w:rPr>
+        <w:lastRenderedPageBreak/>
+        <w:t>大值与最小值之差。再用以上标准将起伏度重分类，得到广西区的地形起伏数据。</w:t>
       </w:r>
     </w:p>
     <w:p>
@@ -433,7 +488,6 @@
         <w:t xml:space="preserve"> </w:t>
       </w:r>
       <w:r>
-        <w:lastRenderedPageBreak/>
         <w:t>（试行</w:t>
       </w:r>
       <w:r>
@@ -1407,12 +1461,14 @@
         </w:rPr>
         <w:t>去掉市名、表头，得到</w:t>
       </w:r>
+      <w:proofErr w:type="spellStart"/>
       <w:r>
         <w:rPr>
           <w:rFonts w:hint="eastAsia"/>
         </w:rPr>
         <w:t>input_data</w:t>
       </w:r>
+      <w:proofErr w:type="spellEnd"/>
       <w:r>
         <w:rPr>
           <w:rFonts w:hint="eastAsia"/>
@@ -1729,12 +1785,14 @@
         </w:rPr>
         <w:t>退火学习率，搭配</w:t>
       </w:r>
+      <w:proofErr w:type="spellStart"/>
       <w:r>
         <w:rPr>
           <w:rFonts w:hint="eastAsia"/>
         </w:rPr>
         <w:t>AdamW</w:t>
       </w:r>
+      <w:proofErr w:type="spellEnd"/>
       <w:r>
         <w:rPr>
           <w:rFonts w:hint="eastAsia"/>
@@ -2199,6 +2257,262 @@
       </w:hyperlink>
     </w:p>
     <w:p/>
+    <w:p>
+      <w:r>
+        <w:rPr>
+          <w:rFonts w:hint="eastAsia"/>
+        </w:rPr>
+        <w:t>2026.3.1</w:t>
+      </w:r>
+      <w:r>
+        <w:rPr>
+          <w:rFonts w:hint="eastAsia"/>
+        </w:rPr>
+        <w:t xml:space="preserve"> </w:t>
+      </w:r>
+      <w:r>
+        <w:rPr>
+          <w:rFonts w:hint="eastAsia"/>
+        </w:rPr>
+        <w:t>修改</w:t>
+      </w:r>
+    </w:p>
+    <w:p>
+      <w:pPr>
+        <w:ind w:firstLineChars="200" w:firstLine="480"/>
+        <w:rPr>
+          <w:rFonts w:hint="eastAsia"/>
+        </w:rPr>
+      </w:pPr>
+      <w:r>
+        <w:t>训练完成后，我们检查了学习到的权重，以评估哪些因素对各产业产生正向或负向贡献。在实验过程中，我们观察到训练后的模型权重在不同训练轮次之间存在显著差异。</w:t>
+      </w:r>
+      <w:r>
+        <w:rPr>
+          <w:rFonts w:hint="eastAsia"/>
+        </w:rPr>
+        <w:t>由此我们提出了问题的可能原因以及解决方法：</w:t>
+      </w:r>
+    </w:p>
+    <w:p>
+      <w:pPr>
+        <w:pStyle w:val="ab"/>
+        <w:numPr>
+          <w:ilvl w:val="0"/>
+          <w:numId w:val="5"/>
+        </w:numPr>
+        <w:ind w:firstLineChars="0"/>
+      </w:pPr>
+      <w:r>
+        <w:t>输入与目标的多重共线性</w:t>
+      </w:r>
+      <w:r>
+        <w:t xml:space="preserve"> </w:t>
+      </w:r>
+    </w:p>
+    <w:p>
+      <w:pPr>
+        <w:pStyle w:val="ab"/>
+        <w:ind w:left="360" w:firstLineChars="0" w:firstLine="0"/>
+      </w:pPr>
+      <w:r>
+        <w:t>输入的地形特征和目标产业产出均为成分数据：</w:t>
+      </w:r>
+    </w:p>
+    <w:p>
+      <w:pPr>
+        <w:ind w:firstLineChars="200" w:firstLine="480"/>
+      </w:pPr>
+      <w:r>
+        <w:rPr>
+          <w:rFonts w:hint="eastAsia"/>
+        </w:rPr>
+        <w:t xml:space="preserve">a. </w:t>
+      </w:r>
+      <w:r>
+        <w:t>四种地形比例之和为</w:t>
+      </w:r>
+      <w:r>
+        <w:t>1</w:t>
+      </w:r>
+      <w:r>
+        <w:t>。</w:t>
+      </w:r>
+    </w:p>
+    <w:p>
+      <w:pPr>
+        <w:ind w:firstLineChars="200" w:firstLine="480"/>
+      </w:pPr>
+      <w:r>
+        <w:rPr>
+          <w:rFonts w:hint="eastAsia"/>
+        </w:rPr>
+        <w:t xml:space="preserve">b. </w:t>
+      </w:r>
+      <w:r>
+        <w:t>五种产业产出比例之和也为</w:t>
+      </w:r>
+      <w:r>
+        <w:t>1</w:t>
+      </w:r>
+      <w:r>
+        <w:t>。</w:t>
+      </w:r>
+    </w:p>
+    <w:p>
+      <w:pPr>
+        <w:ind w:firstLineChars="200" w:firstLine="480"/>
+      </w:pPr>
+      <w:r>
+        <w:t>这导致变量之间存在完全的线性依赖关系，从而产生多重共线性。因此，模型系数对数据的微小变化极为敏感，造成权重估计的不稳定。</w:t>
+      </w:r>
+    </w:p>
+    <w:p>
+      <w:pPr>
+        <w:ind w:firstLineChars="200" w:firstLine="482"/>
+      </w:pPr>
+      <w:r>
+        <w:rPr>
+          <w:b/>
+          <w:bCs/>
+        </w:rPr>
+        <w:t>可能的改进方案</w:t>
+      </w:r>
+      <w:r>
+        <w:rPr>
+          <w:rFonts w:hint="eastAsia"/>
+        </w:rPr>
+        <w:t>：</w:t>
+      </w:r>
+    </w:p>
+    <w:p>
+      <w:pPr>
+        <w:ind w:firstLineChars="200" w:firstLine="480"/>
+      </w:pPr>
+      <w:r>
+        <w:rPr>
+          <w:rFonts w:hint="eastAsia"/>
+        </w:rPr>
+        <w:t>a.</w:t>
+      </w:r>
+      <w:r>
+        <w:t>成分数据转换：由于我们不想从每个成分组中移除任一成分，可以应用成分数据转换（如对数比转换）。</w:t>
+      </w:r>
+      <w:r>
+        <w:t xml:space="preserve"> </w:t>
+      </w:r>
+    </w:p>
+    <w:p>
+      <w:pPr>
+        <w:ind w:firstLineChars="200" w:firstLine="480"/>
+      </w:pPr>
+      <w:r>
+        <w:rPr>
+          <w:rFonts w:hint="eastAsia"/>
+        </w:rPr>
+        <w:t>2.</w:t>
+      </w:r>
+      <w:r>
+        <w:t>小样本量与模型复杂度</w:t>
+      </w:r>
+      <w:r>
+        <w:rPr>
+          <w:rFonts w:hint="eastAsia"/>
+        </w:rPr>
+        <w:t>:</w:t>
+      </w:r>
+    </w:p>
+    <w:p>
+      <w:pPr>
+        <w:ind w:firstLineChars="200" w:firstLine="480"/>
+      </w:pPr>
+      <w:r>
+        <w:t>数据集包含</w:t>
+      </w:r>
+      <w:r>
+        <w:t>140</w:t>
+      </w:r>
+      <w:r>
+        <w:t>个观测值，而模型具有</w:t>
+      </w:r>
+      <w:r>
+        <w:t>35</w:t>
+      </w:r>
+      <w:r>
+        <w:t>个权重</w:t>
+      </w:r>
+      <w:r>
+        <w:t xml:space="preserve"> + 5</w:t>
+      </w:r>
+      <w:r>
+        <w:t>个偏置（共</w:t>
+      </w:r>
+      <w:r>
+        <w:t>40</w:t>
+      </w:r>
+      <w:r>
+        <w:t>个参数）。</w:t>
+      </w:r>
+    </w:p>
+    <w:p>
+      <w:r>
+        <w:t>数据点与模型参数的比值相对较低，这增加了估计方差并降低了模型稳定性。</w:t>
+      </w:r>
+    </w:p>
+    <w:p>
+      <w:pPr>
+        <w:ind w:firstLineChars="150" w:firstLine="361"/>
+      </w:pPr>
+      <w:r>
+        <w:rPr>
+          <w:b/>
+          <w:bCs/>
+        </w:rPr>
+        <w:t>可能的改进方案</w:t>
+      </w:r>
+      <w:r>
+        <w:rPr>
+          <w:rFonts w:hint="eastAsia"/>
+        </w:rPr>
+        <w:t>:</w:t>
+      </w:r>
+    </w:p>
+    <w:p>
+      <w:pPr>
+        <w:pStyle w:val="ab"/>
+        <w:numPr>
+          <w:ilvl w:val="0"/>
+          <w:numId w:val="6"/>
+        </w:numPr>
+        <w:ind w:firstLineChars="0"/>
+      </w:pPr>
+      <w:r>
+        <w:t>增大数据集规模（例如纳入更多年份数据）。</w:t>
+      </w:r>
+      <w:r>
+        <w:t xml:space="preserve"> </w:t>
+      </w:r>
+    </w:p>
+    <w:p>
+      <w:pPr>
+        <w:pStyle w:val="ab"/>
+        <w:numPr>
+          <w:ilvl w:val="0"/>
+          <w:numId w:val="6"/>
+        </w:numPr>
+        <w:ind w:firstLineChars="0"/>
+      </w:pPr>
+      <w:r>
+        <w:t>降低模型复杂度（例如移除年份特征）。</w:t>
+      </w:r>
+    </w:p>
+    <w:p>
+      <w:pPr>
+        <w:rPr>
+          <w:rFonts w:hint="eastAsia"/>
+        </w:rPr>
+      </w:pPr>
+    </w:p>
     <w:sectPr>
       <w:pgSz w:w="11906" w:h="16838"/>
       <w:pgMar w:top="1440" w:right="1800" w:bottom="1440" w:left="1800" w:header="851" w:footer="992" w:gutter="0"/>
@@ -2288,6 +2602,184 @@
     </w:lvl>
   </w:abstractNum>
   <w:abstractNum w:abstractNumId="2" w15:restartNumberingAfterBreak="0">
+    <w:nsid w:val="207C5AD2"/>
+    <w:multiLevelType w:val="hybridMultilevel"/>
+    <w:tmpl w:val="4AF6454C"/>
+    <w:lvl w:ilvl="0" w:tplc="23108590">
+      <w:start w:val="1"/>
+      <w:numFmt w:val="lowerLetter"/>
+      <w:lvlText w:val="%1."/>
+      <w:lvlJc w:val="left"/>
+      <w:pPr>
+        <w:ind w:left="720" w:hanging="360"/>
+      </w:pPr>
+      <w:rPr>
+        <w:rFonts w:hint="default"/>
+      </w:rPr>
+    </w:lvl>
+    <w:lvl w:ilvl="1" w:tplc="04090019" w:tentative="1">
+      <w:start w:val="1"/>
+      <w:numFmt w:val="lowerLetter"/>
+      <w:lvlText w:val="%2)"/>
+      <w:lvlJc w:val="left"/>
+      <w:pPr>
+        <w:ind w:left="1240" w:hanging="440"/>
+      </w:pPr>
+    </w:lvl>
+    <w:lvl w:ilvl="2" w:tplc="0409001B" w:tentative="1">
+      <w:start w:val="1"/>
+      <w:numFmt w:val="lowerRoman"/>
+      <w:lvlText w:val="%3."/>
+      <w:lvlJc w:val="right"/>
+      <w:pPr>
+        <w:ind w:left="1680" w:hanging="440"/>
+      </w:pPr>
+    </w:lvl>
+    <w:lvl w:ilvl="3" w:tplc="0409000F" w:tentative="1">
+      <w:start w:val="1"/>
+      <w:numFmt w:val="decimal"/>
+      <w:lvlText w:val="%4."/>
+      <w:lvlJc w:val="left"/>
+      <w:pPr>
+        <w:ind w:left="2120" w:hanging="440"/>
+      </w:pPr>
+    </w:lvl>
+    <w:lvl w:ilvl="4" w:tplc="04090019" w:tentative="1">
+      <w:start w:val="1"/>
+      <w:numFmt w:val="lowerLetter"/>
+      <w:lvlText w:val="%5)"/>
+      <w:lvlJc w:val="left"/>
+      <w:pPr>
+        <w:ind w:left="2560" w:hanging="440"/>
+      </w:pPr>
+    </w:lvl>
+    <w:lvl w:ilvl="5" w:tplc="0409001B" w:tentative="1">
+      <w:start w:val="1"/>
+      <w:numFmt w:val="lowerRoman"/>
+      <w:lvlText w:val="%6."/>
+      <w:lvlJc w:val="right"/>
+      <w:pPr>
+        <w:ind w:left="3000" w:hanging="440"/>
+      </w:pPr>
+    </w:lvl>
+    <w:lvl w:ilvl="6" w:tplc="0409000F" w:tentative="1">
+      <w:start w:val="1"/>
+      <w:numFmt w:val="decimal"/>
+      <w:lvlText w:val="%7."/>
+      <w:lvlJc w:val="left"/>
+      <w:pPr>
+        <w:ind w:left="3440" w:hanging="440"/>
+      </w:pPr>
+    </w:lvl>
+    <w:lvl w:ilvl="7" w:tplc="04090019" w:tentative="1">
+      <w:start w:val="1"/>
+      <w:numFmt w:val="lowerLetter"/>
+      <w:lvlText w:val="%8)"/>
+      <w:lvlJc w:val="left"/>
+      <w:pPr>
+        <w:ind w:left="3880" w:hanging="440"/>
+      </w:pPr>
+    </w:lvl>
+    <w:lvl w:ilvl="8" w:tplc="0409001B" w:tentative="1">
+      <w:start w:val="1"/>
+      <w:numFmt w:val="lowerRoman"/>
+      <w:lvlText w:val="%9."/>
+      <w:lvlJc w:val="right"/>
+      <w:pPr>
+        <w:ind w:left="4320" w:hanging="440"/>
+      </w:pPr>
+    </w:lvl>
+  </w:abstractNum>
+  <w:abstractNum w:abstractNumId="3" w15:restartNumberingAfterBreak="0">
+    <w:nsid w:val="32A478E6"/>
+    <w:multiLevelType w:val="hybridMultilevel"/>
+    <w:tmpl w:val="10BC4AF8"/>
+    <w:lvl w:ilvl="0" w:tplc="FA7AA6F8">
+      <w:start w:val="1"/>
+      <w:numFmt w:val="decimal"/>
+      <w:lvlText w:val="%1."/>
+      <w:lvlJc w:val="left"/>
+      <w:pPr>
+        <w:ind w:left="360" w:hanging="360"/>
+      </w:pPr>
+      <w:rPr>
+        <w:rFonts w:hint="default"/>
+      </w:rPr>
+    </w:lvl>
+    <w:lvl w:ilvl="1" w:tplc="04090019" w:tentative="1">
+      <w:start w:val="1"/>
+      <w:numFmt w:val="lowerLetter"/>
+      <w:lvlText w:val="%2)"/>
+      <w:lvlJc w:val="left"/>
+      <w:pPr>
+        <w:ind w:left="880" w:hanging="440"/>
+      </w:pPr>
+    </w:lvl>
+    <w:lvl w:ilvl="2" w:tplc="0409001B" w:tentative="1">
+      <w:start w:val="1"/>
+      <w:numFmt w:val="lowerRoman"/>
+      <w:lvlText w:val="%3."/>
+      <w:lvlJc w:val="right"/>
+      <w:pPr>
+        <w:ind w:left="1320" w:hanging="440"/>
+      </w:pPr>
+    </w:lvl>
+    <w:lvl w:ilvl="3" w:tplc="0409000F" w:tentative="1">
+      <w:start w:val="1"/>
+      <w:numFmt w:val="decimal"/>
+      <w:lvlText w:val="%4."/>
+      <w:lvlJc w:val="left"/>
+      <w:pPr>
+        <w:ind w:left="1760" w:hanging="440"/>
+      </w:pPr>
+    </w:lvl>
+    <w:lvl w:ilvl="4" w:tplc="04090019" w:tentative="1">
+      <w:start w:val="1"/>
+      <w:numFmt w:val="lowerLetter"/>
+      <w:lvlText w:val="%5)"/>
+      <w:lvlJc w:val="left"/>
+      <w:pPr>
+        <w:ind w:left="2200" w:hanging="440"/>
+      </w:pPr>
+    </w:lvl>
+    <w:lvl w:ilvl="5" w:tplc="0409001B" w:tentative="1">
+      <w:start w:val="1"/>
+      <w:numFmt w:val="lowerRoman"/>
+      <w:lvlText w:val="%6."/>
+      <w:lvlJc w:val="right"/>
+      <w:pPr>
+        <w:ind w:left="2640" w:hanging="440"/>
+      </w:pPr>
+    </w:lvl>
+    <w:lvl w:ilvl="6" w:tplc="0409000F" w:tentative="1">
+      <w:start w:val="1"/>
+      <w:numFmt w:val="decimal"/>
+      <w:lvlText w:val="%7."/>
+      <w:lvlJc w:val="left"/>
+      <w:pPr>
+        <w:ind w:left="3080" w:hanging="440"/>
+      </w:pPr>
+    </w:lvl>
+    <w:lvl w:ilvl="7" w:tplc="04090019" w:tentative="1">
+      <w:start w:val="1"/>
+      <w:numFmt w:val="lowerLetter"/>
+      <w:lvlText w:val="%8)"/>
+      <w:lvlJc w:val="left"/>
+      <w:pPr>
+        <w:ind w:left="3520" w:hanging="440"/>
+      </w:pPr>
+    </w:lvl>
+    <w:lvl w:ilvl="8" w:tplc="0409001B" w:tentative="1">
+      <w:start w:val="1"/>
+      <w:numFmt w:val="lowerRoman"/>
+      <w:lvlText w:val="%9."/>
+      <w:lvlJc w:val="right"/>
+      <w:pPr>
+        <w:ind w:left="3960" w:hanging="440"/>
+      </w:pPr>
+    </w:lvl>
+  </w:abstractNum>
+  <w:abstractNum w:abstractNumId="4" w15:restartNumberingAfterBreak="0">
     <w:nsid w:val="59F06EB5"/>
     <w:multiLevelType w:val="singleLevel"/>
     <w:tmpl w:val="59F06EB5"/>
@@ -2300,6 +2792,95 @@
         <w:tabs>
           <w:tab w:val="left" w:pos="312"/>
         </w:tabs>
+      </w:pPr>
+    </w:lvl>
+  </w:abstractNum>
+  <w:abstractNum w:abstractNumId="5" w15:restartNumberingAfterBreak="0">
+    <w:nsid w:val="6A405C60"/>
+    <w:multiLevelType w:val="hybridMultilevel"/>
+    <w:tmpl w:val="3140D6E2"/>
+    <w:lvl w:ilvl="0" w:tplc="4D785C4C">
+      <w:start w:val="1"/>
+      <w:numFmt w:val="decimal"/>
+      <w:lvlText w:val="%1."/>
+      <w:lvlJc w:val="left"/>
+      <w:pPr>
+        <w:ind w:left="840" w:hanging="360"/>
+      </w:pPr>
+      <w:rPr>
+        <w:rFonts w:hint="default"/>
+      </w:rPr>
+    </w:lvl>
+    <w:lvl w:ilvl="1" w:tplc="04090019" w:tentative="1">
+      <w:start w:val="1"/>
+      <w:numFmt w:val="lowerLetter"/>
+      <w:lvlText w:val="%2)"/>
+      <w:lvlJc w:val="left"/>
+      <w:pPr>
+        <w:ind w:left="1360" w:hanging="440"/>
+      </w:pPr>
+    </w:lvl>
+    <w:lvl w:ilvl="2" w:tplc="0409001B" w:tentative="1">
+      <w:start w:val="1"/>
+      <w:numFmt w:val="lowerRoman"/>
+      <w:lvlText w:val="%3."/>
+      <w:lvlJc w:val="right"/>
+      <w:pPr>
+        <w:ind w:left="1800" w:hanging="440"/>
+      </w:pPr>
+    </w:lvl>
+    <w:lvl w:ilvl="3" w:tplc="0409000F" w:tentative="1">
+      <w:start w:val="1"/>
+      <w:numFmt w:val="decimal"/>
+      <w:lvlText w:val="%4."/>
+      <w:lvlJc w:val="left"/>
+      <w:pPr>
+        <w:ind w:left="2240" w:hanging="440"/>
+      </w:pPr>
+    </w:lvl>
+    <w:lvl w:ilvl="4" w:tplc="04090019" w:tentative="1">
+      <w:start w:val="1"/>
+      <w:numFmt w:val="lowerLetter"/>
+      <w:lvlText w:val="%5)"/>
+      <w:lvlJc w:val="left"/>
+      <w:pPr>
+        <w:ind w:left="2680" w:hanging="440"/>
+      </w:pPr>
+    </w:lvl>
+    <w:lvl w:ilvl="5" w:tplc="0409001B" w:tentative="1">
+      <w:start w:val="1"/>
+      <w:numFmt w:val="lowerRoman"/>
+      <w:lvlText w:val="%6."/>
+      <w:lvlJc w:val="right"/>
+      <w:pPr>
+        <w:ind w:left="3120" w:hanging="440"/>
+      </w:pPr>
+    </w:lvl>
+    <w:lvl w:ilvl="6" w:tplc="0409000F" w:tentative="1">
+      <w:start w:val="1"/>
+      <w:numFmt w:val="decimal"/>
+      <w:lvlText w:val="%7."/>
+      <w:lvlJc w:val="left"/>
+      <w:pPr>
+        <w:ind w:left="3560" w:hanging="440"/>
+      </w:pPr>
+    </w:lvl>
+    <w:lvl w:ilvl="7" w:tplc="04090019" w:tentative="1">
+      <w:start w:val="1"/>
+      <w:numFmt w:val="lowerLetter"/>
+      <w:lvlText w:val="%8)"/>
+      <w:lvlJc w:val="left"/>
+      <w:pPr>
+        <w:ind w:left="4000" w:hanging="440"/>
+      </w:pPr>
+    </w:lvl>
+    <w:lvl w:ilvl="8" w:tplc="0409001B" w:tentative="1">
+      <w:start w:val="1"/>
+      <w:numFmt w:val="lowerRoman"/>
+      <w:lvlText w:val="%9."/>
+      <w:lvlJc w:val="right"/>
+      <w:pPr>
+        <w:ind w:left="4440" w:hanging="440"/>
       </w:pPr>
     </w:lvl>
   </w:abstractNum>
@@ -2310,6 +2891,15 @@
     <w:abstractNumId w:val="1"/>
   </w:num>
   <w:num w:numId="3" w16cid:durableId="599407995">
+    <w:abstractNumId w:val="4"/>
+  </w:num>
+  <w:num w:numId="4" w16cid:durableId="1556774751">
+    <w:abstractNumId w:val="5"/>
+  </w:num>
+  <w:num w:numId="5" w16cid:durableId="256332194">
+    <w:abstractNumId w:val="3"/>
+  </w:num>
+  <w:num w:numId="6" w16cid:durableId="452217794">
     <w:abstractNumId w:val="2"/>
   </w:num>
 </w:numbering>
@@ -2778,6 +3368,38 @@
       <w:szCs w:val="18"/>
     </w:rPr>
   </w:style>
+  <w:style w:type="paragraph" w:styleId="a9">
+    <w:name w:val="Date"/>
+    <w:basedOn w:val="a"/>
+    <w:next w:val="a"/>
+    <w:link w:val="aa"/>
+    <w:rsid w:val="0081023F"/>
+    <w:pPr>
+      <w:ind w:leftChars="2500" w:left="100"/>
+    </w:pPr>
+  </w:style>
+  <w:style w:type="character" w:customStyle="1" w:styleId="aa">
+    <w:name w:val="日期 字符"/>
+    <w:basedOn w:val="a0"/>
+    <w:link w:val="a9"/>
+    <w:rsid w:val="0081023F"/>
+    <w:rPr>
+      <w:rFonts w:asciiTheme="minorHAnsi" w:hAnsiTheme="minorHAnsi" w:cstheme="minorBidi"/>
+      <w:kern w:val="2"/>
+      <w:sz w:val="24"/>
+      <w:szCs w:val="24"/>
+    </w:rPr>
+  </w:style>
+  <w:style w:type="paragraph" w:styleId="ab">
+    <w:name w:val="List Paragraph"/>
+    <w:basedOn w:val="a"/>
+    <w:uiPriority w:val="99"/>
+    <w:unhideWhenUsed/>
+    <w:rsid w:val="00863D2F"/>
+    <w:pPr>
+      <w:ind w:firstLineChars="200" w:firstLine="420"/>
+    </w:pPr>
+  </w:style>
 </w:styles>
 </file>
 

</xml_diff>